<commit_message>
Se modificó el template de las constancias
</commit_message>
<xml_diff>
--- a/src/modules/constancies/template/constancia.docx
+++ b/src/modules/constancies/template/constancia.docx
@@ -25,7 +25,9 @@
         <w:rPr>
           <w:rFonts w:ascii="Arial" w:cs="Arial" w:eastAsia="Arial" w:hAnsi="Arial"/>
           <w:b w:val="0"/>
+          <w:bCs w:val="0"/>
           <w:i w:val="0"/>
+          <w:iCs w:val="0"/>
           <w:smallCaps w:val="0"/>
           <w:strike w:val="0"/>
           <w:color w:val="000000"/>
@@ -41,18 +43,18 @@
           <w:rFonts w:ascii="Arial" w:cs="Arial" w:eastAsia="Arial" w:hAnsi="Arial"/>
         </w:rPr>
         <w:drawing>
-          <wp:anchor allowOverlap="1" behindDoc="0" distB="114300" distT="114300" distL="114300" distR="114300" hidden="0" layoutInCell="1" locked="0" relativeHeight="0" simplePos="0">
+          <wp:anchor allowOverlap="1" behindDoc="1" distB="0" distT="0" distL="0" distR="0" hidden="0" layoutInCell="1" locked="0" relativeHeight="0" simplePos="0">
             <wp:simplePos x="0" y="0"/>
             <wp:positionH relativeFrom="page">
-              <wp:posOffset>5329238</wp:posOffset>
+              <wp:posOffset>-14283</wp:posOffset>
             </wp:positionH>
             <wp:positionV relativeFrom="page">
-              <wp:posOffset>123825</wp:posOffset>
+              <wp:posOffset>0</wp:posOffset>
             </wp:positionV>
-            <wp:extent cx="1900800" cy="1267200"/>
+            <wp:extent cx="7572375" cy="10725150"/>
             <wp:effectExtent b="0" l="0" r="0" t="0"/>
             <wp:wrapNone/>
-            <wp:docPr id="2" name="image1.png"/>
+            <wp:docPr id="1" name="image1.png"/>
             <a:graphic>
               <a:graphicData uri="http://schemas.openxmlformats.org/drawingml/2006/picture">
                 <pic:pic>
@@ -62,51 +64,6 @@
                   </pic:nvPicPr>
                   <pic:blipFill>
                     <a:blip r:embed="rId6"/>
-                    <a:srcRect b="0" l="0" r="0" t="0"/>
-                    <a:stretch>
-                      <a:fillRect/>
-                    </a:stretch>
-                  </pic:blipFill>
-                  <pic:spPr>
-                    <a:xfrm>
-                      <a:off x="0" y="0"/>
-                      <a:ext cx="1900800" cy="1267200"/>
-                    </a:xfrm>
-                    <a:prstGeom prst="rect"/>
-                    <a:ln/>
-                  </pic:spPr>
-                </pic:pic>
-              </a:graphicData>
-            </a:graphic>
-          </wp:anchor>
-        </w:drawing>
-      </w:r>
-      <w:r>
-        <w:rPr>
-          <w:rFonts w:ascii="Arial" w:cs="Arial" w:eastAsia="Arial" w:hAnsi="Arial"/>
-        </w:rPr>
-        <w:drawing>
-          <wp:anchor allowOverlap="1" behindDoc="1" distB="0" distT="0" distL="0" distR="0" hidden="0" layoutInCell="1" locked="0" relativeHeight="0" simplePos="0">
-            <wp:simplePos x="0" y="0"/>
-            <wp:positionH relativeFrom="page">
-              <wp:posOffset>-14285</wp:posOffset>
-            </wp:positionH>
-            <wp:positionV relativeFrom="page">
-              <wp:posOffset>0</wp:posOffset>
-            </wp:positionV>
-            <wp:extent cx="7572375" cy="10725150"/>
-            <wp:effectExtent b="0" l="0" r="0" t="0"/>
-            <wp:wrapNone/>
-            <wp:docPr id="1" name="image4.png"/>
-            <a:graphic>
-              <a:graphicData uri="http://schemas.openxmlformats.org/drawingml/2006/picture">
-                <pic:pic>
-                  <pic:nvPicPr>
-                    <pic:cNvPr id="0" name="image4.png"/>
-                    <pic:cNvPicPr preferRelativeResize="0"/>
-                  </pic:nvPicPr>
-                  <pic:blipFill>
-                    <a:blip r:embed="rId7"/>
                     <a:srcRect b="0" l="0" r="0" t="0"/>
                     <a:stretch>
                       <a:fillRect/>
@@ -152,7 +109,9 @@
         <w:rPr>
           <w:rFonts w:ascii="Arial" w:cs="Arial" w:eastAsia="Arial" w:hAnsi="Arial"/>
           <w:b w:val="0"/>
+          <w:bCs w:val="0"/>
           <w:i w:val="0"/>
+          <w:iCs w:val="0"/>
           <w:smallCaps w:val="0"/>
           <w:strike w:val="0"/>
           <w:color w:val="000000"/>
@@ -189,7 +148,9 @@
         <w:rPr>
           <w:rFonts w:ascii="Arial" w:cs="Arial" w:eastAsia="Arial" w:hAnsi="Arial"/>
           <w:b w:val="0"/>
+          <w:bCs w:val="0"/>
           <w:i w:val="0"/>
+          <w:iCs w:val="0"/>
           <w:smallCaps w:val="0"/>
           <w:strike w:val="0"/>
           <w:color w:val="000000"/>
@@ -226,7 +187,9 @@
         <w:rPr>
           <w:rFonts w:ascii="Arial" w:cs="Arial" w:eastAsia="Arial" w:hAnsi="Arial"/>
           <w:b w:val="0"/>
+          <w:bCs w:val="0"/>
           <w:i w:val="0"/>
+          <w:iCs w:val="0"/>
           <w:smallCaps w:val="0"/>
           <w:strike w:val="0"/>
           <w:color w:val="000000"/>
@@ -241,7 +204,9 @@
         <w:rPr>
           <w:rFonts w:ascii="Arial" w:cs="Arial" w:eastAsia="Arial" w:hAnsi="Arial"/>
           <w:b w:val="1"/>
+          <w:bCs w:val="1"/>
           <w:i w:val="0"/>
+          <w:iCs w:val="0"/>
           <w:smallCaps w:val="0"/>
           <w:strike w:val="0"/>
           <w:color w:val="000000"/>
@@ -280,7 +245,9 @@
         <w:rPr>
           <w:rFonts w:ascii="Arial" w:cs="Arial" w:eastAsia="Arial" w:hAnsi="Arial"/>
           <w:b w:val="0"/>
+          <w:bCs w:val="0"/>
           <w:i w:val="0"/>
+          <w:iCs w:val="0"/>
           <w:smallCaps w:val="0"/>
           <w:strike w:val="0"/>
           <w:color w:val="000000"/>
@@ -295,7 +262,9 @@
         <w:rPr>
           <w:rFonts w:ascii="Arial" w:cs="Arial" w:eastAsia="Arial" w:hAnsi="Arial"/>
           <w:b w:val="1"/>
+          <w:bCs w:val="1"/>
           <w:i w:val="0"/>
+          <w:iCs w:val="0"/>
           <w:smallCaps w:val="0"/>
           <w:strike w:val="0"/>
           <w:color w:val="000000"/>
@@ -377,7 +346,9 @@
               <w:rPr>
                 <w:rFonts w:ascii="Arial" w:cs="Arial" w:eastAsia="Arial" w:hAnsi="Arial"/>
                 <w:b w:val="0"/>
-                <w:i w:val="0"/>
+                <w:bCs w:val="0"/>
+                <w:i w:val="0"/>
+                <w:iCs w:val="0"/>
                 <w:smallCaps w:val="0"/>
                 <w:strike w:val="0"/>
                 <w:color w:val="000000"/>
@@ -392,7 +363,9 @@
               <w:rPr>
                 <w:rFonts w:ascii="Arial" w:cs="Arial" w:eastAsia="Arial" w:hAnsi="Arial"/>
                 <w:b w:val="0"/>
-                <w:i w:val="0"/>
+                <w:bCs w:val="0"/>
+                <w:i w:val="0"/>
+                <w:iCs w:val="0"/>
                 <w:smallCaps w:val="0"/>
                 <w:strike w:val="0"/>
                 <w:color w:val="000000"/>
@@ -451,7 +424,9 @@
               <w:rPr>
                 <w:rFonts w:ascii="Arial" w:cs="Arial" w:eastAsia="Arial" w:hAnsi="Arial"/>
                 <w:b w:val="0"/>
-                <w:i w:val="0"/>
+                <w:bCs w:val="0"/>
+                <w:i w:val="0"/>
+                <w:iCs w:val="0"/>
                 <w:smallCaps w:val="0"/>
                 <w:strike w:val="0"/>
                 <w:color w:val="000000"/>
@@ -567,7 +542,9 @@
               <w:rPr>
                 <w:rFonts w:ascii="Arial" w:cs="Arial" w:eastAsia="Arial" w:hAnsi="Arial"/>
                 <w:b w:val="0"/>
-                <w:i w:val="0"/>
+                <w:bCs w:val="0"/>
+                <w:i w:val="0"/>
+                <w:iCs w:val="0"/>
                 <w:smallCaps w:val="0"/>
                 <w:strike w:val="0"/>
                 <w:color w:val="000000"/>
@@ -582,7 +559,9 @@
               <w:rPr>
                 <w:rFonts w:ascii="Arial" w:cs="Arial" w:eastAsia="Arial" w:hAnsi="Arial"/>
                 <w:b w:val="0"/>
-                <w:i w:val="0"/>
+                <w:bCs w:val="0"/>
+                <w:i w:val="0"/>
+                <w:iCs w:val="0"/>
                 <w:smallCaps w:val="0"/>
                 <w:strike w:val="0"/>
                 <w:color w:val="000000"/>
@@ -626,7 +605,9 @@
               <w:rPr>
                 <w:rFonts w:ascii="Arial" w:cs="Arial" w:eastAsia="Arial" w:hAnsi="Arial"/>
                 <w:b w:val="0"/>
-                <w:i w:val="0"/>
+                <w:bCs w:val="0"/>
+                <w:i w:val="0"/>
+                <w:iCs w:val="0"/>
                 <w:smallCaps w:val="0"/>
                 <w:strike w:val="0"/>
                 <w:color w:val="000000"/>
@@ -641,7 +622,9 @@
               <w:rPr>
                 <w:rFonts w:ascii="Arial" w:cs="Arial" w:eastAsia="Arial" w:hAnsi="Arial"/>
                 <w:b w:val="0"/>
-                <w:i w:val="0"/>
+                <w:bCs w:val="0"/>
+                <w:i w:val="0"/>
+                <w:iCs w:val="0"/>
                 <w:smallCaps w:val="0"/>
                 <w:strike w:val="0"/>
                 <w:color w:val="000000"/>
@@ -674,7 +657,9 @@
               <w:rPr>
                 <w:rFonts w:ascii="Arial" w:cs="Arial" w:eastAsia="Arial" w:hAnsi="Arial"/>
                 <w:b w:val="0"/>
-                <w:i w:val="0"/>
+                <w:bCs w:val="0"/>
+                <w:i w:val="0"/>
+                <w:iCs w:val="0"/>
                 <w:smallCaps w:val="0"/>
                 <w:strike w:val="0"/>
                 <w:color w:val="000000"/>
@@ -820,7 +805,9 @@
               <w:rPr>
                 <w:rFonts w:ascii="Arial" w:cs="Arial" w:eastAsia="Arial" w:hAnsi="Arial"/>
                 <w:b w:val="0"/>
-                <w:i w:val="0"/>
+                <w:bCs w:val="0"/>
+                <w:i w:val="0"/>
+                <w:iCs w:val="0"/>
                 <w:smallCaps w:val="0"/>
                 <w:strike w:val="0"/>
                 <w:color w:val="000000"/>
@@ -835,7 +822,9 @@
               <w:rPr>
                 <w:rFonts w:ascii="Arial" w:cs="Arial" w:eastAsia="Arial" w:hAnsi="Arial"/>
                 <w:b w:val="0"/>
-                <w:i w:val="0"/>
+                <w:bCs w:val="0"/>
+                <w:i w:val="0"/>
+                <w:iCs w:val="0"/>
                 <w:smallCaps w:val="0"/>
                 <w:strike w:val="0"/>
                 <w:color w:val="000000"/>
@@ -868,7 +857,9 @@
               <w:rPr>
                 <w:rFonts w:ascii="Arial" w:cs="Arial" w:eastAsia="Arial" w:hAnsi="Arial"/>
                 <w:b w:val="0"/>
-                <w:i w:val="0"/>
+                <w:bCs w:val="0"/>
+                <w:i w:val="0"/>
+                <w:iCs w:val="0"/>
                 <w:smallCaps w:val="0"/>
                 <w:strike w:val="0"/>
                 <w:color w:val="000000"/>
@@ -917,7 +908,9 @@
         <w:rPr>
           <w:rFonts w:ascii="Arial" w:cs="Arial" w:eastAsia="Arial" w:hAnsi="Arial"/>
           <w:b w:val="0"/>
+          <w:bCs w:val="0"/>
           <w:i w:val="0"/>
+          <w:iCs w:val="0"/>
           <w:smallCaps w:val="0"/>
           <w:strike w:val="0"/>
           <w:color w:val="000000"/>
@@ -1025,7 +1018,9 @@
               <w:rPr>
                 <w:rFonts w:ascii="Arial" w:cs="Arial" w:eastAsia="Arial" w:hAnsi="Arial"/>
                 <w:b w:val="0"/>
-                <w:i w:val="0"/>
+                <w:bCs w:val="0"/>
+                <w:i w:val="0"/>
+                <w:iCs w:val="0"/>
                 <w:smallCaps w:val="0"/>
                 <w:strike w:val="0"/>
                 <w:color w:val="000000"/>
@@ -1040,7 +1035,9 @@
               <w:rPr>
                 <w:rFonts w:ascii="Arial" w:cs="Arial" w:eastAsia="Arial" w:hAnsi="Arial"/>
                 <w:b w:val="1"/>
-                <w:i w:val="0"/>
+                <w:bCs w:val="1"/>
+                <w:i w:val="0"/>
+                <w:iCs w:val="0"/>
                 <w:smallCaps w:val="0"/>
                 <w:strike w:val="0"/>
                 <w:color w:val="000000"/>
@@ -1097,7 +1094,9 @@
               <w:rPr>
                 <w:rFonts w:ascii="Arial" w:cs="Arial" w:eastAsia="Arial" w:hAnsi="Arial"/>
                 <w:b w:val="0"/>
-                <w:i w:val="0"/>
+                <w:bCs w:val="0"/>
+                <w:i w:val="0"/>
+                <w:iCs w:val="0"/>
                 <w:smallCaps w:val="0"/>
                 <w:strike w:val="0"/>
                 <w:color w:val="000000"/>
@@ -1112,7 +1111,9 @@
               <w:rPr>
                 <w:rFonts w:ascii="Arial" w:cs="Arial" w:eastAsia="Arial" w:hAnsi="Arial"/>
                 <w:b w:val="0"/>
-                <w:i w:val="0"/>
+                <w:bCs w:val="0"/>
+                <w:i w:val="0"/>
+                <w:iCs w:val="0"/>
                 <w:smallCaps w:val="0"/>
                 <w:strike w:val="0"/>
                 <w:color w:val="000000"/>
@@ -1218,7 +1219,9 @@
               <w:rPr>
                 <w:rFonts w:ascii="Arial" w:cs="Arial" w:eastAsia="Arial" w:hAnsi="Arial"/>
                 <w:b w:val="0"/>
-                <w:i w:val="0"/>
+                <w:bCs w:val="0"/>
+                <w:i w:val="0"/>
+                <w:iCs w:val="0"/>
                 <w:smallCaps w:val="0"/>
                 <w:strike w:val="0"/>
                 <w:color w:val="000000"/>
@@ -1233,7 +1236,9 @@
               <w:rPr>
                 <w:rFonts w:ascii="Arial" w:cs="Arial" w:eastAsia="Arial" w:hAnsi="Arial"/>
                 <w:b w:val="0"/>
-                <w:i w:val="0"/>
+                <w:bCs w:val="0"/>
+                <w:i w:val="0"/>
+                <w:iCs w:val="0"/>
                 <w:smallCaps w:val="0"/>
                 <w:strike w:val="0"/>
                 <w:color w:val="000000"/>
@@ -1285,7 +1290,9 @@
               <w:rPr>
                 <w:rFonts w:ascii="Arial" w:cs="Arial" w:eastAsia="Arial" w:hAnsi="Arial"/>
                 <w:b w:val="0"/>
-                <w:i w:val="0"/>
+                <w:bCs w:val="0"/>
+                <w:i w:val="0"/>
+                <w:iCs w:val="0"/>
                 <w:smallCaps w:val="0"/>
                 <w:strike w:val="0"/>
                 <w:color w:val="000000"/>
@@ -1332,7 +1339,9 @@
         <w:rPr>
           <w:rFonts w:ascii="Arial" w:cs="Arial" w:eastAsia="Arial" w:hAnsi="Arial"/>
           <w:b w:val="0"/>
+          <w:bCs w:val="0"/>
           <w:i w:val="0"/>
+          <w:iCs w:val="0"/>
           <w:smallCaps w:val="0"/>
           <w:strike w:val="0"/>
           <w:color w:val="000000"/>
@@ -1445,7 +1454,9 @@
               <w:rPr>
                 <w:rFonts w:ascii="Arial" w:cs="Arial" w:eastAsia="Arial" w:hAnsi="Arial"/>
                 <w:b w:val="0"/>
-                <w:i w:val="0"/>
+                <w:bCs w:val="0"/>
+                <w:i w:val="0"/>
+                <w:iCs w:val="0"/>
                 <w:smallCaps w:val="0"/>
                 <w:strike w:val="0"/>
                 <w:color w:val="000000"/>
@@ -1460,7 +1471,9 @@
               <w:rPr>
                 <w:rFonts w:ascii="Arial" w:cs="Arial" w:eastAsia="Arial" w:hAnsi="Arial"/>
                 <w:b w:val="1"/>
-                <w:i w:val="0"/>
+                <w:bCs w:val="1"/>
+                <w:i w:val="0"/>
+                <w:iCs w:val="0"/>
                 <w:smallCaps w:val="0"/>
                 <w:strike w:val="0"/>
                 <w:color w:val="000000"/>
@@ -1516,7 +1529,9 @@
               <w:rPr>
                 <w:rFonts w:ascii="Arial" w:cs="Arial" w:eastAsia="Arial" w:hAnsi="Arial"/>
                 <w:b w:val="0"/>
-                <w:i w:val="0"/>
+                <w:bCs w:val="0"/>
+                <w:i w:val="0"/>
+                <w:iCs w:val="0"/>
                 <w:smallCaps w:val="0"/>
                 <w:strike w:val="0"/>
                 <w:color w:val="000000"/>
@@ -1531,7 +1546,9 @@
               <w:rPr>
                 <w:rFonts w:ascii="Arial" w:cs="Arial" w:eastAsia="Arial" w:hAnsi="Arial"/>
                 <w:b w:val="0"/>
-                <w:i w:val="0"/>
+                <w:bCs w:val="0"/>
+                <w:i w:val="0"/>
+                <w:iCs w:val="0"/>
                 <w:smallCaps w:val="0"/>
                 <w:strike w:val="0"/>
                 <w:color w:val="000000"/>
@@ -1635,7 +1652,9 @@
               <w:rPr>
                 <w:rFonts w:ascii="Arial" w:cs="Arial" w:eastAsia="Arial" w:hAnsi="Arial"/>
                 <w:b w:val="0"/>
-                <w:i w:val="0"/>
+                <w:bCs w:val="0"/>
+                <w:i w:val="0"/>
+                <w:iCs w:val="0"/>
                 <w:smallCaps w:val="0"/>
                 <w:strike w:val="0"/>
                 <w:color w:val="000000"/>
@@ -1650,7 +1669,9 @@
               <w:rPr>
                 <w:rFonts w:ascii="Arial" w:cs="Arial" w:eastAsia="Arial" w:hAnsi="Arial"/>
                 <w:b w:val="0"/>
-                <w:i w:val="0"/>
+                <w:bCs w:val="0"/>
+                <w:i w:val="0"/>
+                <w:iCs w:val="0"/>
                 <w:smallCaps w:val="0"/>
                 <w:strike w:val="0"/>
                 <w:color w:val="000000"/>
@@ -1683,7 +1704,9 @@
               <w:rPr>
                 <w:rFonts w:ascii="Arial" w:cs="Arial" w:eastAsia="Arial" w:hAnsi="Arial"/>
                 <w:b w:val="0"/>
-                <w:i w:val="0"/>
+                <w:bCs w:val="0"/>
+                <w:i w:val="0"/>
+                <w:iCs w:val="0"/>
                 <w:smallCaps w:val="0"/>
                 <w:strike w:val="0"/>
                 <w:color w:val="000000"/>
@@ -1698,7 +1721,9 @@
               <w:rPr>
                 <w:rFonts w:ascii="Arial" w:cs="Arial" w:eastAsia="Arial" w:hAnsi="Arial"/>
                 <w:b w:val="0"/>
-                <w:i w:val="0"/>
+                <w:bCs w:val="0"/>
+                <w:i w:val="0"/>
+                <w:iCs w:val="0"/>
                 <w:smallCaps w:val="0"/>
                 <w:strike w:val="0"/>
                 <w:color w:val="000000"/>
@@ -1741,7 +1766,9 @@
               <w:rPr>
                 <w:rFonts w:ascii="Arial" w:cs="Arial" w:eastAsia="Arial" w:hAnsi="Arial"/>
                 <w:b w:val="0"/>
-                <w:i w:val="0"/>
+                <w:bCs w:val="0"/>
+                <w:i w:val="0"/>
+                <w:iCs w:val="0"/>
                 <w:smallCaps w:val="0"/>
                 <w:strike w:val="0"/>
                 <w:color w:val="000000"/>
@@ -1756,7 +1783,9 @@
               <w:rPr>
                 <w:rFonts w:ascii="Arial" w:cs="Arial" w:eastAsia="Arial" w:hAnsi="Arial"/>
                 <w:b w:val="0"/>
-                <w:i w:val="0"/>
+                <w:bCs w:val="0"/>
+                <w:i w:val="0"/>
+                <w:iCs w:val="0"/>
                 <w:smallCaps w:val="0"/>
                 <w:strike w:val="0"/>
                 <w:color w:val="000000"/>
@@ -1800,7 +1829,9 @@
               <w:rPr>
                 <w:rFonts w:ascii="Arial" w:cs="Arial" w:eastAsia="Arial" w:hAnsi="Arial"/>
                 <w:b w:val="0"/>
-                <w:i w:val="0"/>
+                <w:bCs w:val="0"/>
+                <w:i w:val="0"/>
+                <w:iCs w:val="0"/>
                 <w:smallCaps w:val="0"/>
                 <w:strike w:val="0"/>
                 <w:color w:val="000000"/>
@@ -1815,7 +1846,9 @@
               <w:rPr>
                 <w:rFonts w:ascii="Arial" w:cs="Arial" w:eastAsia="Arial" w:hAnsi="Arial"/>
                 <w:b w:val="0"/>
-                <w:i w:val="0"/>
+                <w:bCs w:val="0"/>
+                <w:i w:val="0"/>
+                <w:iCs w:val="0"/>
                 <w:smallCaps w:val="0"/>
                 <w:strike w:val="0"/>
                 <w:color w:val="000000"/>
@@ -1859,7 +1892,9 @@
               <w:rPr>
                 <w:rFonts w:ascii="Arial" w:cs="Arial" w:eastAsia="Arial" w:hAnsi="Arial"/>
                 <w:b w:val="0"/>
-                <w:i w:val="0"/>
+                <w:bCs w:val="0"/>
+                <w:i w:val="0"/>
+                <w:iCs w:val="0"/>
                 <w:smallCaps w:val="0"/>
                 <w:strike w:val="0"/>
                 <w:color w:val="000000"/>
@@ -1874,7 +1909,9 @@
               <w:rPr>
                 <w:rFonts w:ascii="Arial" w:cs="Arial" w:eastAsia="Arial" w:hAnsi="Arial"/>
                 <w:b w:val="0"/>
-                <w:i w:val="0"/>
+                <w:bCs w:val="0"/>
+                <w:i w:val="0"/>
+                <w:iCs w:val="0"/>
                 <w:smallCaps w:val="0"/>
                 <w:strike w:val="0"/>
                 <w:color w:val="000000"/>
@@ -1918,7 +1955,9 @@
               <w:rPr>
                 <w:rFonts w:ascii="Arial" w:cs="Arial" w:eastAsia="Arial" w:hAnsi="Arial"/>
                 <w:b w:val="0"/>
-                <w:i w:val="0"/>
+                <w:bCs w:val="0"/>
+                <w:i w:val="0"/>
+                <w:iCs w:val="0"/>
                 <w:smallCaps w:val="0"/>
                 <w:strike w:val="0"/>
                 <w:color w:val="000000"/>
@@ -1933,7 +1972,9 @@
               <w:rPr>
                 <w:rFonts w:ascii="Arial" w:cs="Arial" w:eastAsia="Arial" w:hAnsi="Arial"/>
                 <w:b w:val="0"/>
-                <w:i w:val="0"/>
+                <w:bCs w:val="0"/>
+                <w:i w:val="0"/>
+                <w:iCs w:val="0"/>
                 <w:smallCaps w:val="0"/>
                 <w:strike w:val="0"/>
                 <w:color w:val="000000"/>
@@ -1976,7 +2017,9 @@
               <w:rPr>
                 <w:rFonts w:ascii="Arial" w:cs="Arial" w:eastAsia="Arial" w:hAnsi="Arial"/>
                 <w:b w:val="0"/>
-                <w:i w:val="0"/>
+                <w:bCs w:val="0"/>
+                <w:i w:val="0"/>
+                <w:iCs w:val="0"/>
                 <w:smallCaps w:val="0"/>
                 <w:strike w:val="0"/>
                 <w:color w:val="000000"/>
@@ -1991,7 +2034,9 @@
               <w:rPr>
                 <w:rFonts w:ascii="Arial" w:cs="Arial" w:eastAsia="Arial" w:hAnsi="Arial"/>
                 <w:b w:val="0"/>
-                <w:i w:val="0"/>
+                <w:bCs w:val="0"/>
+                <w:i w:val="0"/>
+                <w:iCs w:val="0"/>
                 <w:smallCaps w:val="0"/>
                 <w:strike w:val="0"/>
                 <w:color w:val="000000"/>
@@ -2035,7 +2080,9 @@
               <w:rPr>
                 <w:rFonts w:ascii="Arial" w:cs="Arial" w:eastAsia="Arial" w:hAnsi="Arial"/>
                 <w:b w:val="0"/>
-                <w:i w:val="0"/>
+                <w:bCs w:val="0"/>
+                <w:i w:val="0"/>
+                <w:iCs w:val="0"/>
                 <w:smallCaps w:val="0"/>
                 <w:strike w:val="0"/>
                 <w:color w:val="000000"/>
@@ -2050,7 +2097,9 @@
               <w:rPr>
                 <w:rFonts w:ascii="Arial" w:cs="Arial" w:eastAsia="Arial" w:hAnsi="Arial"/>
                 <w:b w:val="0"/>
-                <w:i w:val="0"/>
+                <w:bCs w:val="0"/>
+                <w:i w:val="0"/>
+                <w:iCs w:val="0"/>
                 <w:smallCaps w:val="0"/>
                 <w:strike w:val="0"/>
                 <w:color w:val="000000"/>
@@ -2094,7 +2143,9 @@
               <w:rPr>
                 <w:rFonts w:ascii="Arial" w:cs="Arial" w:eastAsia="Arial" w:hAnsi="Arial"/>
                 <w:b w:val="0"/>
-                <w:i w:val="0"/>
+                <w:bCs w:val="0"/>
+                <w:i w:val="0"/>
+                <w:iCs w:val="0"/>
                 <w:smallCaps w:val="0"/>
                 <w:strike w:val="0"/>
                 <w:color w:val="000000"/>
@@ -2109,7 +2160,9 @@
               <w:rPr>
                 <w:rFonts w:ascii="Arial" w:cs="Arial" w:eastAsia="Arial" w:hAnsi="Arial"/>
                 <w:b w:val="0"/>
-                <w:i w:val="0"/>
+                <w:bCs w:val="0"/>
+                <w:i w:val="0"/>
+                <w:iCs w:val="0"/>
                 <w:smallCaps w:val="0"/>
                 <w:strike w:val="0"/>
                 <w:color w:val="000000"/>
@@ -2153,7 +2206,9 @@
               <w:rPr>
                 <w:rFonts w:ascii="Arial" w:cs="Arial" w:eastAsia="Arial" w:hAnsi="Arial"/>
                 <w:b w:val="0"/>
-                <w:i w:val="0"/>
+                <w:bCs w:val="0"/>
+                <w:i w:val="0"/>
+                <w:iCs w:val="0"/>
                 <w:smallCaps w:val="0"/>
                 <w:strike w:val="0"/>
                 <w:color w:val="000000"/>
@@ -2168,7 +2223,9 @@
               <w:rPr>
                 <w:rFonts w:ascii="Arial" w:cs="Arial" w:eastAsia="Arial" w:hAnsi="Arial"/>
                 <w:b w:val="0"/>
-                <w:i w:val="0"/>
+                <w:bCs w:val="0"/>
+                <w:i w:val="0"/>
+                <w:iCs w:val="0"/>
                 <w:smallCaps w:val="0"/>
                 <w:strike w:val="0"/>
                 <w:color w:val="000000"/>
@@ -2219,7 +2276,9 @@
               <w:rPr>
                 <w:rFonts w:ascii="Arial" w:cs="Arial" w:eastAsia="Arial" w:hAnsi="Arial"/>
                 <w:b w:val="0"/>
-                <w:i w:val="0"/>
+                <w:bCs w:val="0"/>
+                <w:i w:val="0"/>
+                <w:iCs w:val="0"/>
                 <w:smallCaps w:val="0"/>
                 <w:strike w:val="0"/>
                 <w:color w:val="000000"/>
@@ -2266,7 +2325,9 @@
               <w:rPr>
                 <w:rFonts w:ascii="Arial" w:cs="Arial" w:eastAsia="Arial" w:hAnsi="Arial"/>
                 <w:b w:val="0"/>
-                <w:i w:val="0"/>
+                <w:bCs w:val="0"/>
+                <w:i w:val="0"/>
+                <w:iCs w:val="0"/>
                 <w:smallCaps w:val="0"/>
                 <w:strike w:val="0"/>
                 <w:color w:val="000000"/>
@@ -2314,7 +2375,9 @@
               <w:rPr>
                 <w:rFonts w:ascii="Arial" w:cs="Arial" w:eastAsia="Arial" w:hAnsi="Arial"/>
                 <w:b w:val="0"/>
-                <w:i w:val="0"/>
+                <w:bCs w:val="0"/>
+                <w:i w:val="0"/>
+                <w:iCs w:val="0"/>
                 <w:smallCaps w:val="0"/>
                 <w:strike w:val="0"/>
                 <w:color w:val="000000"/>
@@ -2369,7 +2432,9 @@
               <w:rPr>
                 <w:rFonts w:ascii="Arial" w:cs="Arial" w:eastAsia="Arial" w:hAnsi="Arial"/>
                 <w:b w:val="0"/>
-                <w:i w:val="0"/>
+                <w:bCs w:val="0"/>
+                <w:i w:val="0"/>
+                <w:iCs w:val="0"/>
                 <w:smallCaps w:val="0"/>
                 <w:strike w:val="0"/>
                 <w:color w:val="000000"/>
@@ -2423,7 +2488,9 @@
               <w:rPr>
                 <w:rFonts w:ascii="Arial" w:cs="Arial" w:eastAsia="Arial" w:hAnsi="Arial"/>
                 <w:b w:val="0"/>
-                <w:i w:val="0"/>
+                <w:bCs w:val="0"/>
+                <w:i w:val="0"/>
+                <w:iCs w:val="0"/>
                 <w:smallCaps w:val="0"/>
                 <w:strike w:val="0"/>
                 <w:color w:val="000000"/>
@@ -2477,7 +2544,9 @@
               <w:rPr>
                 <w:rFonts w:ascii="Arial" w:cs="Arial" w:eastAsia="Arial" w:hAnsi="Arial"/>
                 <w:b w:val="0"/>
-                <w:i w:val="0"/>
+                <w:bCs w:val="0"/>
+                <w:i w:val="0"/>
+                <w:iCs w:val="0"/>
                 <w:smallCaps w:val="0"/>
                 <w:strike w:val="0"/>
                 <w:color w:val="000000"/>
@@ -2525,7 +2594,9 @@
               <w:rPr>
                 <w:rFonts w:ascii="Arial" w:cs="Arial" w:eastAsia="Arial" w:hAnsi="Arial"/>
                 <w:b w:val="0"/>
-                <w:i w:val="0"/>
+                <w:bCs w:val="0"/>
+                <w:i w:val="0"/>
+                <w:iCs w:val="0"/>
                 <w:smallCaps w:val="0"/>
                 <w:strike w:val="0"/>
                 <w:color w:val="000000"/>
@@ -2580,7 +2651,9 @@
               <w:rPr>
                 <w:rFonts w:ascii="Arial" w:cs="Arial" w:eastAsia="Arial" w:hAnsi="Arial"/>
                 <w:b w:val="0"/>
-                <w:i w:val="0"/>
+                <w:bCs w:val="0"/>
+                <w:i w:val="0"/>
+                <w:iCs w:val="0"/>
                 <w:smallCaps w:val="0"/>
                 <w:strike w:val="0"/>
                 <w:color w:val="000000"/>
@@ -2635,7 +2708,9 @@
               <w:rPr>
                 <w:rFonts w:ascii="Arial" w:cs="Arial" w:eastAsia="Arial" w:hAnsi="Arial"/>
                 <w:b w:val="0"/>
-                <w:i w:val="0"/>
+                <w:bCs w:val="0"/>
+                <w:i w:val="0"/>
+                <w:iCs w:val="0"/>
                 <w:smallCaps w:val="0"/>
                 <w:strike w:val="0"/>
                 <w:color w:val="000000"/>
@@ -2697,7 +2772,9 @@
               <w:rPr>
                 <w:rFonts w:ascii="Arial" w:cs="Arial" w:eastAsia="Arial" w:hAnsi="Arial"/>
                 <w:b w:val="0"/>
-                <w:i w:val="0"/>
+                <w:bCs w:val="0"/>
+                <w:i w:val="0"/>
+                <w:iCs w:val="0"/>
                 <w:smallCaps w:val="0"/>
                 <w:strike w:val="0"/>
                 <w:color w:val="000000"/>
@@ -2712,7 +2789,9 @@
               <w:rPr>
                 <w:rFonts w:ascii="Arial" w:cs="Arial" w:eastAsia="Arial" w:hAnsi="Arial"/>
                 <w:b w:val="0"/>
-                <w:i w:val="0"/>
+                <w:bCs w:val="0"/>
+                <w:i w:val="0"/>
+                <w:iCs w:val="0"/>
                 <w:smallCaps w:val="0"/>
                 <w:strike w:val="0"/>
                 <w:color w:val="000000"/>
@@ -2745,7 +2824,9 @@
               <w:rPr>
                 <w:rFonts w:ascii="Arial" w:cs="Arial" w:eastAsia="Arial" w:hAnsi="Arial"/>
                 <w:b w:val="0"/>
-                <w:i w:val="0"/>
+                <w:bCs w:val="0"/>
+                <w:i w:val="0"/>
+                <w:iCs w:val="0"/>
                 <w:smallCaps w:val="0"/>
                 <w:strike w:val="0"/>
                 <w:color w:val="000000"/>
@@ -2807,7 +2888,9 @@
               <w:rPr>
                 <w:rFonts w:ascii="Arial" w:cs="Arial" w:eastAsia="Arial" w:hAnsi="Arial"/>
                 <w:b w:val="0"/>
-                <w:i w:val="0"/>
+                <w:bCs w:val="0"/>
+                <w:i w:val="0"/>
+                <w:iCs w:val="0"/>
                 <w:smallCaps w:val="0"/>
                 <w:strike w:val="0"/>
                 <w:color w:val="000000"/>
@@ -2822,7 +2905,9 @@
               <w:rPr>
                 <w:rFonts w:ascii="Arial" w:cs="Arial" w:eastAsia="Arial" w:hAnsi="Arial"/>
                 <w:b w:val="0"/>
-                <w:i w:val="0"/>
+                <w:bCs w:val="0"/>
+                <w:i w:val="0"/>
+                <w:iCs w:val="0"/>
                 <w:smallCaps w:val="0"/>
                 <w:strike w:val="0"/>
                 <w:color w:val="000000"/>
@@ -2855,7 +2940,9 @@
               <w:rPr>
                 <w:rFonts w:ascii="Arial" w:cs="Arial" w:eastAsia="Arial" w:hAnsi="Arial"/>
                 <w:b w:val="0"/>
-                <w:i w:val="0"/>
+                <w:bCs w:val="0"/>
+                <w:i w:val="0"/>
+                <w:iCs w:val="0"/>
                 <w:smallCaps w:val="0"/>
                 <w:strike w:val="0"/>
                 <w:color w:val="000000"/>
@@ -2891,7 +2978,9 @@
               <w:rPr>
                 <w:rFonts w:ascii="Arial" w:cs="Arial" w:eastAsia="Arial" w:hAnsi="Arial"/>
                 <w:b w:val="0"/>
-                <w:i w:val="0"/>
+                <w:bCs w:val="0"/>
+                <w:i w:val="0"/>
+                <w:iCs w:val="0"/>
                 <w:smallCaps w:val="0"/>
                 <w:strike w:val="0"/>
                 <w:color w:val="000000"/>
@@ -2906,7 +2995,9 @@
               <w:rPr>
                 <w:rFonts w:ascii="Arial" w:cs="Arial" w:eastAsia="Arial" w:hAnsi="Arial"/>
                 <w:b w:val="0"/>
-                <w:i w:val="0"/>
+                <w:bCs w:val="0"/>
+                <w:i w:val="0"/>
+                <w:iCs w:val="0"/>
                 <w:smallCaps w:val="0"/>
                 <w:strike w:val="0"/>
                 <w:color w:val="000000"/>
@@ -2943,7 +3034,9 @@
         <w:rPr>
           <w:rFonts w:ascii="Arial" w:cs="Arial" w:eastAsia="Arial" w:hAnsi="Arial"/>
           <w:b w:val="0"/>
+          <w:bCs w:val="0"/>
           <w:i w:val="0"/>
+          <w:iCs w:val="0"/>
           <w:smallCaps w:val="0"/>
           <w:strike w:val="0"/>
           <w:color w:val="000000"/>
@@ -3023,7 +3116,9 @@
               <w:rPr>
                 <w:rFonts w:ascii="Arial" w:cs="Arial" w:eastAsia="Arial" w:hAnsi="Arial"/>
                 <w:b w:val="0"/>
-                <w:i w:val="0"/>
+                <w:bCs w:val="0"/>
+                <w:i w:val="0"/>
+                <w:iCs w:val="0"/>
                 <w:smallCaps w:val="0"/>
                 <w:strike w:val="0"/>
                 <w:color w:val="000000"/>
@@ -3038,7 +3133,9 @@
               <w:rPr>
                 <w:rFonts w:ascii="Arial" w:cs="Arial" w:eastAsia="Arial" w:hAnsi="Arial"/>
                 <w:b w:val="1"/>
-                <w:i w:val="0"/>
+                <w:bCs w:val="1"/>
+                <w:i w:val="0"/>
+                <w:iCs w:val="0"/>
                 <w:smallCaps w:val="0"/>
                 <w:strike w:val="0"/>
                 <w:color w:val="000000"/>
@@ -3091,7 +3188,9 @@
               <w:rPr>
                 <w:rFonts w:ascii="Arial" w:cs="Arial" w:eastAsia="Arial" w:hAnsi="Arial"/>
                 <w:b w:val="0"/>
-                <w:i w:val="0"/>
+                <w:bCs w:val="0"/>
+                <w:i w:val="0"/>
+                <w:iCs w:val="0"/>
                 <w:smallCaps w:val="0"/>
                 <w:strike w:val="0"/>
                 <w:color w:val="000000"/>
@@ -3135,7 +3234,9 @@
               <w:rPr>
                 <w:rFonts w:ascii="Arial" w:cs="Arial" w:eastAsia="Arial" w:hAnsi="Arial"/>
                 <w:b w:val="0"/>
-                <w:i w:val="0"/>
+                <w:bCs w:val="0"/>
+                <w:i w:val="0"/>
+                <w:iCs w:val="0"/>
                 <w:smallCaps w:val="0"/>
                 <w:strike w:val="0"/>
                 <w:color w:val="000000"/>
@@ -3150,7 +3251,9 @@
               <w:rPr>
                 <w:rFonts w:ascii="Arial" w:cs="Arial" w:eastAsia="Arial" w:hAnsi="Arial"/>
                 <w:b w:val="0"/>
-                <w:i w:val="0"/>
+                <w:bCs w:val="0"/>
+                <w:i w:val="0"/>
+                <w:iCs w:val="0"/>
                 <w:smallCaps w:val="0"/>
                 <w:strike w:val="0"/>
                 <w:color w:val="000000"/>
@@ -3183,7 +3286,9 @@
               <w:rPr>
                 <w:rFonts w:ascii="Arial" w:cs="Arial" w:eastAsia="Arial" w:hAnsi="Arial"/>
                 <w:b w:val="0"/>
-                <w:i w:val="0"/>
+                <w:bCs w:val="0"/>
+                <w:i w:val="0"/>
+                <w:iCs w:val="0"/>
                 <w:smallCaps w:val="0"/>
                 <w:strike w:val="0"/>
                 <w:color w:val="000000"/>
@@ -3198,7 +3303,9 @@
               <w:rPr>
                 <w:rFonts w:ascii="Arial" w:cs="Arial" w:eastAsia="Arial" w:hAnsi="Arial"/>
                 <w:b w:val="0"/>
-                <w:i w:val="0"/>
+                <w:bCs w:val="0"/>
+                <w:i w:val="0"/>
+                <w:iCs w:val="0"/>
                 <w:smallCaps w:val="0"/>
                 <w:strike w:val="0"/>
                 <w:color w:val="000000"/>
@@ -3224,16 +3331,16 @@
                   <wp:extent cx="1292860" cy="614680"/>
                   <wp:effectExtent b="0" l="0" r="0" t="0"/>
                   <wp:wrapNone/>
-                  <wp:docPr id="4" name="image3.png"/>
+                  <wp:docPr id="2" name="image2.png"/>
                   <a:graphic>
                     <a:graphicData uri="http://schemas.openxmlformats.org/drawingml/2006/picture">
                       <pic:pic>
                         <pic:nvPicPr>
-                          <pic:cNvPr id="0" name="image3.png"/>
+                          <pic:cNvPr id="0" name="image2.png"/>
                           <pic:cNvPicPr preferRelativeResize="0"/>
                         </pic:nvPicPr>
                         <pic:blipFill>
-                          <a:blip r:embed="rId8"/>
+                          <a:blip r:embed="rId7"/>
                           <a:srcRect b="0" l="0" r="0" t="0"/>
                           <a:stretch>
                             <a:fillRect/>
@@ -3273,7 +3380,9 @@
               <w:rPr>
                 <w:rFonts w:ascii="Arial" w:cs="Arial" w:eastAsia="Arial" w:hAnsi="Arial"/>
                 <w:b w:val="0"/>
-                <w:i w:val="0"/>
+                <w:bCs w:val="0"/>
+                <w:i w:val="0"/>
+                <w:iCs w:val="0"/>
                 <w:smallCaps w:val="0"/>
                 <w:strike w:val="0"/>
                 <w:color w:val="000000"/>
@@ -3314,7 +3423,9 @@
               <w:rPr>
                 <w:rFonts w:ascii="Arial" w:cs="Arial" w:eastAsia="Arial" w:hAnsi="Arial"/>
                 <w:b w:val="0"/>
-                <w:i w:val="0"/>
+                <w:bCs w:val="0"/>
+                <w:i w:val="0"/>
+                <w:iCs w:val="0"/>
                 <w:smallCaps w:val="0"/>
                 <w:strike w:val="0"/>
                 <w:color w:val="000000"/>
@@ -3358,7 +3469,9 @@
               <w:rPr>
                 <w:rFonts w:ascii="Arial" w:cs="Arial" w:eastAsia="Arial" w:hAnsi="Arial"/>
                 <w:b w:val="0"/>
-                <w:i w:val="0"/>
+                <w:bCs w:val="0"/>
+                <w:i w:val="0"/>
+                <w:iCs w:val="0"/>
                 <w:smallCaps w:val="0"/>
                 <w:strike w:val="0"/>
                 <w:color w:val="000000"/>
@@ -3373,7 +3486,9 @@
               <w:rPr>
                 <w:rFonts w:ascii="Arial" w:cs="Arial" w:eastAsia="Arial" w:hAnsi="Arial"/>
                 <w:b w:val="0"/>
-                <w:i w:val="0"/>
+                <w:bCs w:val="0"/>
+                <w:i w:val="0"/>
+                <w:iCs w:val="0"/>
                 <w:smallCaps w:val="0"/>
                 <w:strike w:val="0"/>
                 <w:color w:val="000000"/>
@@ -3406,7 +3521,9 @@
               <w:rPr>
                 <w:rFonts w:ascii="Arial" w:cs="Arial" w:eastAsia="Arial" w:hAnsi="Arial"/>
                 <w:b w:val="0"/>
-                <w:i w:val="0"/>
+                <w:bCs w:val="0"/>
+                <w:i w:val="0"/>
+                <w:iCs w:val="0"/>
                 <w:smallCaps w:val="0"/>
                 <w:strike w:val="0"/>
                 <w:color w:val="000000"/>
@@ -3456,7 +3573,9 @@
               <w:rPr>
                 <w:rFonts w:ascii="Arial" w:cs="Arial" w:eastAsia="Arial" w:hAnsi="Arial"/>
                 <w:b w:val="0"/>
-                <w:i w:val="0"/>
+                <w:bCs w:val="0"/>
+                <w:i w:val="0"/>
+                <w:iCs w:val="0"/>
                 <w:smallCaps w:val="0"/>
                 <w:strike w:val="0"/>
                 <w:color w:val="000000"/>
@@ -3500,7 +3619,9 @@
               <w:rPr>
                 <w:rFonts w:ascii="Arial" w:cs="Arial" w:eastAsia="Arial" w:hAnsi="Arial"/>
                 <w:b w:val="0"/>
-                <w:i w:val="0"/>
+                <w:bCs w:val="0"/>
+                <w:i w:val="0"/>
+                <w:iCs w:val="0"/>
                 <w:smallCaps w:val="0"/>
                 <w:strike w:val="0"/>
                 <w:color w:val="000000"/>
@@ -3515,7 +3636,9 @@
               <w:rPr>
                 <w:rFonts w:ascii="Arial" w:cs="Arial" w:eastAsia="Arial" w:hAnsi="Arial"/>
                 <w:b w:val="0"/>
-                <w:i w:val="0"/>
+                <w:bCs w:val="0"/>
+                <w:i w:val="0"/>
+                <w:iCs w:val="0"/>
                 <w:smallCaps w:val="0"/>
                 <w:strike w:val="0"/>
                 <w:color w:val="000000"/>
@@ -3570,7 +3693,9 @@
               <w:rPr>
                 <w:rFonts w:ascii="Arial" w:cs="Arial" w:eastAsia="Arial" w:hAnsi="Arial"/>
                 <w:b w:val="0"/>
-                <w:i w:val="0"/>
+                <w:bCs w:val="0"/>
+                <w:i w:val="0"/>
+                <w:iCs w:val="0"/>
                 <w:smallCaps w:val="0"/>
                 <w:strike w:val="0"/>
                 <w:color w:val="000000"/>
@@ -3622,7 +3747,9 @@
               <w:rPr>
                 <w:rFonts w:ascii="Arial" w:cs="Arial" w:eastAsia="Arial" w:hAnsi="Arial"/>
                 <w:b w:val="0"/>
-                <w:i w:val="0"/>
+                <w:bCs w:val="0"/>
+                <w:i w:val="0"/>
+                <w:iCs w:val="0"/>
                 <w:smallCaps w:val="0"/>
                 <w:strike w:val="0"/>
                 <w:color w:val="000000"/>
@@ -3667,7 +3794,9 @@
               <w:rPr>
                 <w:rFonts w:ascii="Arial" w:cs="Arial" w:eastAsia="Arial" w:hAnsi="Arial"/>
                 <w:b w:val="0"/>
-                <w:i w:val="0"/>
+                <w:bCs w:val="0"/>
+                <w:i w:val="0"/>
+                <w:iCs w:val="0"/>
                 <w:smallCaps w:val="0"/>
                 <w:strike w:val="0"/>
                 <w:color w:val="000000"/>
@@ -3682,7 +3811,9 @@
               <w:rPr>
                 <w:rFonts w:ascii="Arial" w:cs="Arial" w:eastAsia="Arial" w:hAnsi="Arial"/>
                 <w:b w:val="0"/>
-                <w:i w:val="0"/>
+                <w:bCs w:val="0"/>
+                <w:i w:val="0"/>
+                <w:iCs w:val="0"/>
                 <w:smallCaps w:val="0"/>
                 <w:strike w:val="0"/>
                 <w:color w:val="000000"/>
@@ -3723,7 +3854,9 @@
               <w:rPr>
                 <w:rFonts w:ascii="Arial" w:cs="Arial" w:eastAsia="Arial" w:hAnsi="Arial"/>
                 <w:b w:val="0"/>
-                <w:i w:val="0"/>
+                <w:bCs w:val="0"/>
+                <w:i w:val="0"/>
+                <w:iCs w:val="0"/>
                 <w:smallCaps w:val="0"/>
                 <w:strike w:val="0"/>
                 <w:color w:val="000000"/>
@@ -3768,7 +3901,9 @@
               <w:rPr>
                 <w:rFonts w:ascii="Arial" w:cs="Arial" w:eastAsia="Arial" w:hAnsi="Arial"/>
                 <w:b w:val="0"/>
-                <w:i w:val="0"/>
+                <w:bCs w:val="0"/>
+                <w:i w:val="0"/>
+                <w:iCs w:val="0"/>
                 <w:smallCaps w:val="0"/>
                 <w:strike w:val="0"/>
                 <w:color w:val="000000"/>
@@ -3783,7 +3918,9 @@
               <w:rPr>
                 <w:rFonts w:ascii="Arial" w:cs="Arial" w:eastAsia="Arial" w:hAnsi="Arial"/>
                 <w:b w:val="0"/>
-                <w:i w:val="0"/>
+                <w:bCs w:val="0"/>
+                <w:i w:val="0"/>
+                <w:iCs w:val="0"/>
                 <w:smallCaps w:val="0"/>
                 <w:strike w:val="0"/>
                 <w:color w:val="000000"/>
@@ -3824,7 +3961,9 @@
               <w:rPr>
                 <w:rFonts w:ascii="Arial" w:cs="Arial" w:eastAsia="Arial" w:hAnsi="Arial"/>
                 <w:b w:val="0"/>
-                <w:i w:val="0"/>
+                <w:bCs w:val="0"/>
+                <w:i w:val="0"/>
+                <w:iCs w:val="0"/>
                 <w:smallCaps w:val="0"/>
                 <w:strike w:val="0"/>
                 <w:color w:val="000000"/>
@@ -3869,7 +4008,9 @@
               <w:rPr>
                 <w:rFonts w:ascii="Arial" w:cs="Arial" w:eastAsia="Arial" w:hAnsi="Arial"/>
                 <w:b w:val="0"/>
-                <w:i w:val="0"/>
+                <w:bCs w:val="0"/>
+                <w:i w:val="0"/>
+                <w:iCs w:val="0"/>
                 <w:smallCaps w:val="0"/>
                 <w:strike w:val="0"/>
                 <w:color w:val="000000"/>
@@ -3884,7 +4025,9 @@
               <w:rPr>
                 <w:rFonts w:ascii="Arial" w:cs="Arial" w:eastAsia="Arial" w:hAnsi="Arial"/>
                 <w:b w:val="0"/>
-                <w:i w:val="0"/>
+                <w:bCs w:val="0"/>
+                <w:i w:val="0"/>
+                <w:iCs w:val="0"/>
                 <w:smallCaps w:val="0"/>
                 <w:strike w:val="0"/>
                 <w:color w:val="000000"/>
@@ -3926,7 +4069,9 @@
               <w:rPr>
                 <w:rFonts w:ascii="Arial" w:cs="Arial" w:eastAsia="Arial" w:hAnsi="Arial"/>
                 <w:b w:val="0"/>
-                <w:i w:val="0"/>
+                <w:bCs w:val="0"/>
+                <w:i w:val="0"/>
+                <w:iCs w:val="0"/>
                 <w:smallCaps w:val="0"/>
                 <w:strike w:val="0"/>
                 <w:color w:val="000000"/>
@@ -3966,7 +4111,9 @@
         <w:rPr>
           <w:rFonts w:ascii="Arial" w:cs="Arial" w:eastAsia="Arial" w:hAnsi="Arial"/>
           <w:b w:val="0"/>
+          <w:bCs w:val="0"/>
           <w:i w:val="0"/>
+          <w:iCs w:val="0"/>
           <w:smallCaps w:val="0"/>
           <w:strike w:val="0"/>
           <w:color w:val="000000"/>
@@ -3981,7 +4128,9 @@
         <w:rPr>
           <w:rFonts w:ascii="Arial" w:cs="Arial" w:eastAsia="Arial" w:hAnsi="Arial"/>
           <w:b w:val="1"/>
+          <w:bCs w:val="1"/>
           <w:i w:val="0"/>
+          <w:iCs w:val="0"/>
           <w:smallCaps w:val="0"/>
           <w:strike w:val="0"/>
           <w:color w:val="000000"/>
@@ -4020,7 +4169,9 @@
         <w:rPr>
           <w:rFonts w:ascii="Arial" w:cs="Arial" w:eastAsia="Arial" w:hAnsi="Arial"/>
           <w:b w:val="0"/>
+          <w:bCs w:val="0"/>
           <w:i w:val="0"/>
+          <w:iCs w:val="0"/>
           <w:smallCaps w:val="0"/>
           <w:strike w:val="0"/>
           <w:color w:val="000000"/>
@@ -4035,7 +4186,9 @@
         <w:rPr>
           <w:rFonts w:ascii="Arial" w:cs="Arial" w:eastAsia="Arial" w:hAnsi="Arial"/>
           <w:b w:val="0"/>
+          <w:bCs w:val="0"/>
           <w:i w:val="0"/>
+          <w:iCs w:val="0"/>
           <w:smallCaps w:val="0"/>
           <w:strike w:val="0"/>
           <w:color w:val="000000"/>
@@ -4069,7 +4222,9 @@
         <w:rPr>
           <w:rFonts w:ascii="Arial" w:cs="Arial" w:eastAsia="Arial" w:hAnsi="Arial"/>
           <w:b w:val="0"/>
+          <w:bCs w:val="0"/>
           <w:i w:val="0"/>
+          <w:iCs w:val="0"/>
           <w:smallCaps w:val="0"/>
           <w:strike w:val="0"/>
           <w:color w:val="000000"/>
@@ -4084,7 +4239,9 @@
         <w:rPr>
           <w:rFonts w:ascii="Arial" w:cs="Arial" w:eastAsia="Arial" w:hAnsi="Arial"/>
           <w:b w:val="0"/>
+          <w:bCs w:val="0"/>
           <w:i w:val="0"/>
+          <w:iCs w:val="0"/>
           <w:smallCaps w:val="0"/>
           <w:strike w:val="0"/>
           <w:color w:val="000000"/>
@@ -4118,7 +4275,9 @@
         <w:rPr>
           <w:rFonts w:ascii="Arial" w:cs="Arial" w:eastAsia="Arial" w:hAnsi="Arial"/>
           <w:b w:val="0"/>
+          <w:bCs w:val="0"/>
           <w:i w:val="0"/>
+          <w:iCs w:val="0"/>
           <w:smallCaps w:val="0"/>
           <w:strike w:val="0"/>
           <w:color w:val="000000"/>
@@ -4133,7 +4292,9 @@
         <w:rPr>
           <w:rFonts w:ascii="Arial" w:cs="Arial" w:eastAsia="Arial" w:hAnsi="Arial"/>
           <w:b w:val="0"/>
+          <w:bCs w:val="0"/>
           <w:i w:val="0"/>
+          <w:iCs w:val="0"/>
           <w:smallCaps w:val="0"/>
           <w:strike w:val="0"/>
           <w:color w:val="000000"/>
@@ -4148,12 +4309,14 @@
         <w:tab/>
         <w:t xml:space="preserve">Las áreas y subáreas ocupacionales del Catálogo Nacional de Ocupaciones se encuentran disponibles en el reverso de este formato y en la página </w:t>
       </w:r>
-      <w:hyperlink r:id="rId9">
+      <w:hyperlink r:id="rId8">
         <w:r>
           <w:rPr>
             <w:rFonts w:ascii="Arial" w:cs="Arial" w:eastAsia="Arial" w:hAnsi="Arial"/>
             <w:b w:val="0"/>
+            <w:bCs w:val="0"/>
             <w:i w:val="0"/>
+            <w:iCs w:val="0"/>
             <w:smallCaps w:val="0"/>
             <w:strike w:val="0"/>
             <w:color w:val="0000ff"/>
@@ -4171,7 +4334,9 @@
         <w:rPr>
           <w:rFonts w:ascii="Arial" w:cs="Arial" w:eastAsia="Arial" w:hAnsi="Arial"/>
           <w:b w:val="0"/>
+          <w:bCs w:val="0"/>
           <w:i w:val="0"/>
+          <w:iCs w:val="0"/>
           <w:smallCaps w:val="0"/>
           <w:strike w:val="0"/>
           <w:color w:val="000000"/>
@@ -4205,7 +4370,9 @@
         <w:rPr>
           <w:rFonts w:ascii="Arial" w:cs="Arial" w:eastAsia="Arial" w:hAnsi="Arial"/>
           <w:b w:val="0"/>
+          <w:bCs w:val="0"/>
           <w:i w:val="0"/>
+          <w:iCs w:val="0"/>
           <w:smallCaps w:val="0"/>
           <w:strike w:val="0"/>
           <w:color w:val="000000"/>
@@ -4220,7 +4387,9 @@
         <w:rPr>
           <w:rFonts w:ascii="Arial" w:cs="Arial" w:eastAsia="Arial" w:hAnsi="Arial"/>
           <w:b w:val="0"/>
+          <w:bCs w:val="0"/>
           <w:i w:val="0"/>
+          <w:iCs w:val="0"/>
           <w:smallCaps w:val="0"/>
           <w:strike w:val="0"/>
           <w:color w:val="000000"/>
@@ -4235,12 +4404,14 @@
         <w:tab/>
         <w:t xml:space="preserve">Las áreas temáticas de los cursos se encuentran disponibles en el reverso de este formato y en la página </w:t>
       </w:r>
-      <w:hyperlink r:id="rId10">
+      <w:hyperlink r:id="rId9">
         <w:r>
           <w:rPr>
             <w:rFonts w:ascii="Arial" w:cs="Arial" w:eastAsia="Arial" w:hAnsi="Arial"/>
             <w:b w:val="0"/>
+            <w:bCs w:val="0"/>
             <w:i w:val="0"/>
+            <w:iCs w:val="0"/>
             <w:smallCaps w:val="0"/>
             <w:strike w:val="0"/>
             <w:color w:val="0000ff"/>
@@ -4280,7 +4451,9 @@
         <w:rPr>
           <w:rFonts w:ascii="Arial" w:cs="Arial" w:eastAsia="Arial" w:hAnsi="Arial"/>
           <w:b w:val="0"/>
+          <w:bCs w:val="0"/>
           <w:i w:val="0"/>
+          <w:iCs w:val="0"/>
           <w:smallCaps w:val="0"/>
           <w:strike w:val="0"/>
           <w:color w:val="000000"/>
@@ -4295,7 +4468,9 @@
         <w:rPr>
           <w:rFonts w:ascii="Arial" w:cs="Arial" w:eastAsia="Arial" w:hAnsi="Arial"/>
           <w:b w:val="0"/>
+          <w:bCs w:val="0"/>
           <w:i w:val="0"/>
+          <w:iCs w:val="0"/>
           <w:smallCaps w:val="0"/>
           <w:strike w:val="0"/>
           <w:color w:val="000000"/>
@@ -4329,7 +4504,9 @@
         <w:rPr>
           <w:rFonts w:ascii="Arial" w:cs="Arial" w:eastAsia="Arial" w:hAnsi="Arial"/>
           <w:b w:val="0"/>
+          <w:bCs w:val="0"/>
           <w:i w:val="0"/>
+          <w:iCs w:val="0"/>
           <w:smallCaps w:val="0"/>
           <w:strike w:val="0"/>
           <w:color w:val="000000"/>
@@ -4344,7 +4521,9 @@
         <w:rPr>
           <w:rFonts w:ascii="Arial" w:cs="Arial" w:eastAsia="Arial" w:hAnsi="Arial"/>
           <w:b w:val="0"/>
+          <w:bCs w:val="0"/>
           <w:i w:val="0"/>
+          <w:iCs w:val="0"/>
           <w:smallCaps w:val="0"/>
           <w:strike w:val="0"/>
           <w:color w:val="000000"/>
@@ -4370,7 +4549,9 @@
         <w:rPr>
           <w:rFonts w:ascii="Arial" w:cs="Arial" w:eastAsia="Arial" w:hAnsi="Arial"/>
           <w:b w:val="0"/>
+          <w:bCs w:val="0"/>
           <w:i w:val="0"/>
+          <w:iCs w:val="0"/>
           <w:smallCaps w:val="0"/>
           <w:strike w:val="0"/>
           <w:color w:val="000000"/>
@@ -4404,7 +4585,9 @@
         <w:rPr>
           <w:rFonts w:ascii="Arial" w:cs="Arial" w:eastAsia="Arial" w:hAnsi="Arial"/>
           <w:b w:val="0"/>
+          <w:bCs w:val="0"/>
           <w:i w:val="0"/>
+          <w:iCs w:val="0"/>
           <w:smallCaps w:val="0"/>
           <w:strike w:val="0"/>
           <w:color w:val="000000"/>
@@ -4419,7 +4602,9 @@
         <w:rPr>
           <w:rFonts w:ascii="Arial" w:cs="Arial" w:eastAsia="Arial" w:hAnsi="Arial"/>
           <w:b w:val="0"/>
+          <w:bCs w:val="0"/>
           <w:i w:val="0"/>
+          <w:iCs w:val="0"/>
           <w:smallCaps w:val="0"/>
           <w:strike w:val="0"/>
           <w:color w:val="000000"/>
@@ -4453,7 +4638,9 @@
         <w:rPr>
           <w:rFonts w:ascii="Arial" w:cs="Arial" w:eastAsia="Arial" w:hAnsi="Arial"/>
           <w:b w:val="0"/>
+          <w:bCs w:val="0"/>
           <w:i w:val="0"/>
+          <w:iCs w:val="0"/>
           <w:smallCaps w:val="0"/>
           <w:strike w:val="0"/>
           <w:color w:val="000000"/>
@@ -4468,7 +4655,9 @@
         <w:rPr>
           <w:rFonts w:ascii="Arial" w:cs="Arial" w:eastAsia="Arial" w:hAnsi="Arial"/>
           <w:b w:val="0"/>
+          <w:bCs w:val="0"/>
           <w:i w:val="0"/>
+          <w:iCs w:val="0"/>
           <w:smallCaps w:val="0"/>
           <w:strike w:val="0"/>
           <w:color w:val="000000"/>
@@ -4505,7 +4694,9 @@
         <w:rPr>
           <w:rFonts w:ascii="Arial" w:cs="Arial" w:eastAsia="Arial" w:hAnsi="Arial"/>
           <w:b w:val="0"/>
+          <w:bCs w:val="0"/>
           <w:i w:val="0"/>
+          <w:iCs w:val="0"/>
           <w:smallCaps w:val="0"/>
           <w:strike w:val="0"/>
           <w:color w:val="000000"/>
@@ -4520,7 +4711,9 @@
         <w:rPr>
           <w:rFonts w:ascii="Arial" w:cs="Arial" w:eastAsia="Arial" w:hAnsi="Arial"/>
           <w:b w:val="0"/>
+          <w:bCs w:val="0"/>
           <w:i w:val="0"/>
+          <w:iCs w:val="0"/>
           <w:smallCaps w:val="0"/>
           <w:strike w:val="0"/>
           <w:color w:val="000000"/>
@@ -4537,7 +4730,9 @@
         <w:rPr>
           <w:rFonts w:ascii="Arial" w:cs="Arial" w:eastAsia="Arial" w:hAnsi="Arial"/>
           <w:b w:val="0"/>
+          <w:bCs w:val="0"/>
           <w:i w:val="0"/>
+          <w:iCs w:val="0"/>
           <w:smallCaps w:val="0"/>
           <w:strike w:val="0"/>
           <w:color w:val="000000"/>
@@ -4549,48 +4744,6 @@
           <w:rtl w:val="0"/>
         </w:rPr>
         <w:t xml:space="preserve"> </w:t>
-      </w:r>
-      <w:r>
-        <w:drawing>
-          <wp:anchor allowOverlap="1" behindDoc="0" distB="19050" distT="19050" distL="19050" distR="19050" hidden="0" layoutInCell="1" locked="0" relativeHeight="0" simplePos="0">
-            <wp:simplePos x="0" y="0"/>
-            <wp:positionH relativeFrom="column">
-              <wp:posOffset>5448300</wp:posOffset>
-            </wp:positionH>
-            <wp:positionV relativeFrom="paragraph">
-              <wp:posOffset>133350</wp:posOffset>
-            </wp:positionV>
-            <wp:extent cx="747820" cy="747820"/>
-            <wp:effectExtent b="0" l="0" r="0" t="0"/>
-            <wp:wrapNone/>
-            <wp:docPr id="3" name="image2.png"/>
-            <a:graphic>
-              <a:graphicData uri="http://schemas.openxmlformats.org/drawingml/2006/picture">
-                <pic:pic>
-                  <pic:nvPicPr>
-                    <pic:cNvPr id="0" name="image2.png"/>
-                    <pic:cNvPicPr preferRelativeResize="0"/>
-                  </pic:nvPicPr>
-                  <pic:blipFill>
-                    <a:blip r:embed="rId11"/>
-                    <a:srcRect b="0" l="0" r="0" t="0"/>
-                    <a:stretch>
-                      <a:fillRect/>
-                    </a:stretch>
-                  </pic:blipFill>
-                  <pic:spPr>
-                    <a:xfrm>
-                      <a:off x="0" y="0"/>
-                      <a:ext cx="747820" cy="747820"/>
-                    </a:xfrm>
-                    <a:prstGeom prst="rect"/>
-                    <a:ln/>
-                  </pic:spPr>
-                </pic:pic>
-              </a:graphicData>
-            </a:graphic>
-          </wp:anchor>
-        </w:drawing>
       </w:r>
     </w:p>
     <w:p>
@@ -4616,7 +4769,9 @@
         <w:rPr>
           <w:rFonts w:ascii="Arial" w:cs="Arial" w:eastAsia="Arial" w:hAnsi="Arial"/>
           <w:b w:val="0"/>
+          <w:bCs w:val="0"/>
           <w:i w:val="0"/>
+          <w:iCs w:val="0"/>
           <w:smallCaps w:val="0"/>
           <w:strike w:val="0"/>
           <w:color w:val="000000"/>
@@ -4676,7 +4831,9 @@
         <w:rPr>
           <w:rFonts w:ascii="Arial" w:cs="Arial" w:eastAsia="Arial" w:hAnsi="Arial"/>
           <w:b w:val="1"/>
+          <w:bCs w:val="1"/>
           <w:i w:val="1"/>
+          <w:iCs w:val="1"/>
           <w:color w:val="000099"/>
           <w:sz w:val="18"/>
           <w:szCs w:val="18"/>
@@ -4714,7 +4871,9 @@
         <w:rPr>
           <w:rFonts w:ascii="Arial" w:cs="Arial" w:eastAsia="Arial" w:hAnsi="Arial"/>
           <w:b w:val="1"/>
+          <w:bCs w:val="1"/>
           <w:i w:val="1"/>
+          <w:iCs w:val="1"/>
           <w:sz w:val="18"/>
           <w:szCs w:val="18"/>
           <w:rtl w:val="0"/>
@@ -4778,6 +4937,7 @@
     </w:pPr>
     <w:rPr>
       <w:b w:val="1"/>
+      <w:bCs w:val="1"/>
       <w:sz w:val="48"/>
       <w:szCs w:val="48"/>
     </w:rPr>
@@ -4794,6 +4954,7 @@
     </w:pPr>
     <w:rPr>
       <w:b w:val="1"/>
+      <w:bCs w:val="1"/>
       <w:sz w:val="36"/>
       <w:szCs w:val="36"/>
     </w:rPr>
@@ -4810,6 +4971,7 @@
     </w:pPr>
     <w:rPr>
       <w:b w:val="1"/>
+      <w:bCs w:val="1"/>
       <w:sz w:val="28"/>
       <w:szCs w:val="28"/>
     </w:rPr>
@@ -4826,6 +4988,7 @@
     </w:pPr>
     <w:rPr>
       <w:b w:val="1"/>
+      <w:bCs w:val="1"/>
       <w:sz w:val="24"/>
       <w:szCs w:val="24"/>
     </w:rPr>
@@ -4842,6 +5005,7 @@
     </w:pPr>
     <w:rPr>
       <w:b w:val="1"/>
+      <w:bCs w:val="1"/>
       <w:sz w:val="22"/>
       <w:szCs w:val="22"/>
     </w:rPr>
@@ -4858,6 +5022,7 @@
     </w:pPr>
     <w:rPr>
       <w:b w:val="1"/>
+      <w:bCs w:val="1"/>
       <w:sz w:val="20"/>
       <w:szCs w:val="20"/>
     </w:rPr>
@@ -4874,6 +5039,7 @@
     </w:pPr>
     <w:rPr>
       <w:b w:val="1"/>
+      <w:bCs w:val="1"/>
       <w:sz w:val="72"/>
       <w:szCs w:val="72"/>
     </w:rPr>
@@ -4891,6 +5057,7 @@
     <w:rPr>
       <w:rFonts w:ascii="Georgia" w:cs="Georgia" w:eastAsia="Georgia" w:hAnsi="Georgia"/>
       <w:i w:val="1"/>
+      <w:iCs w:val="1"/>
       <w:color w:val="666666"/>
       <w:sz w:val="48"/>
       <w:szCs w:val="48"/>

</xml_diff>